<commit_message>
Improve template and parsing for optional bilingual content
Update DOCX templates to include a dedicated bilingual section and improve parsing logic in `lib/importValidator.ts` to handle optional secondary fields gracefully.

Replit-Commit-Author: Agent
Replit-Commit-Session-Id: 746a8cf9-eee5-4aa3-b53e-95853956a157
Replit-Commit-Checkpoint-Type: full_checkpoint
Replit-Commit-Event-Id: 7958424f-1669-4518-be68-200d8b71f8fc
Replit-Commit-Screenshot-Url: https://storage.googleapis.com/screenshot-production-us-central1/999277e6-b640-4bf4-8437-9ea2b127d433/746a8cf9-eee5-4aa3-b53e-95853956a157/uPXBxf3
</commit_message>
<xml_diff>
--- a/public/downloads/saphala_group_question_template_v3.docx
+++ b/public/downloads/saphala_group_question_template_v3.docx
@@ -1664,7 +1664,61 @@
         </w:rPr>
       </w:pPr>
       <w:r>
-        <w:t xml:space="preserve">Example — Passage with Three Sub-questions</w:t>
+        <w:t xml:space="preserve">Bilingual Support (Optional)</w:t>
+      </w:r>
+    </w:p>
+    <w:p>
+      <w:pPr>
+        <w:spacing w:after="60" w:before="60"/>
+        <w:ind w:left="288"/>
+      </w:pPr>
+      <w:r>
+        <w:rPr>
+          <w:i/>
+          <w:iCs/>
+          <w:color w:val="1D4ED8"/>
+          <w:sz w:val="18"/>
+          <w:szCs w:val="18"/>
+        </w:rPr>
+        <w:t xml:space="preserve">ℹ️  All 'Secondary' fields are completely optional. Leave them out for English-only questions — the importer will parse the file cleanly with no errors or warnings.</w:t>
+      </w:r>
+    </w:p>
+    <w:p>
+      <w:pPr>
+        <w:spacing w:after="60" w:before="60"/>
+      </w:pPr>
+    </w:p>
+    <w:p>
+      <w:pPr>
+        <w:spacing w:after="60" w:before="60"/>
+      </w:pPr>
+      <w:r>
+        <w:rPr>
+          <w:color w:val="6B7280"/>
+          <w:sz w:val="20"/>
+          <w:szCs w:val="20"/>
+        </w:rPr>
+        <w:t xml:space="preserve">You can add 'Passage Secondary:' after 'Passage:', and 'Question Secondary:', 'Option A Secondary:', etc. inside each question block. Any fields you omit simply won't have a secondary translation.</w:t>
+      </w:r>
+    </w:p>
+    <w:p>
+      <w:pPr>
+        <w:pBdr>
+          <w:bottom w:val="single" w:color="E2E8F0" w:sz="1"/>
+        </w:pBdr>
+        <w:spacing w:after="120" w:before="120"/>
+      </w:pPr>
+    </w:p>
+    <w:p>
+      <w:pPr>
+        <w:pStyle w:val="Heading2"/>
+        <w:spacing w:after="80" w:before="240"/>
+        <w:rPr>
+          <w:color w:val="1D4ED8"/>
+        </w:rPr>
+      </w:pPr>
+      <w:r>
+        <w:t xml:space="preserve">Example — Passage with Three Sub-questions (English-only)</w:t>
       </w:r>
     </w:p>
     <w:tbl>

</xml_diff>

<commit_message>
Enhance question templates to fully support bilingual content and formatting
Update DOCX templates and generation script to improve bilingual question formatting, including adding secondary language fields for passages, question stems, options, and explanations in both single and group question formats.

Replit-Commit-Author: Agent
Replit-Commit-Session-Id: 746a8cf9-eee5-4aa3-b53e-95853956a157
Replit-Commit-Checkpoint-Type: full_checkpoint
Replit-Commit-Event-Id: 5f88eb97-f58f-4b32-8ae5-8afc00bfbfb1
Replit-Commit-Screenshot-Url: https://storage.googleapis.com/screenshot-production-us-central1/999277e6-b640-4bf4-8437-9ea2b127d433/746a8cf9-eee5-4aa3-b53e-95853956a157/uPXBxf3
</commit_message>
<xml_diff>
--- a/public/downloads/saphala_group_question_template_v3.docx
+++ b/public/downloads/saphala_group_question_template_v3.docx
@@ -391,6 +391,23 @@
           <w:sz w:val="19"/>
           <w:szCs w:val="19"/>
         </w:rPr>
+        <w:t xml:space="preserve">Optionally add Passage Secondary: directly after Passage: for a bilingual passage</w:t>
+      </w:r>
+    </w:p>
+    <w:p>
+      <w:pPr>
+        <w:pStyle w:val="ListParagraph"/>
+        <w:numPr>
+          <w:ilvl w:val="0"/>
+          <w:numId w:val="1"/>
+        </w:numPr>
+        <w:spacing w:after="40" w:before="40"/>
+      </w:pPr>
+      <w:r>
+        <w:rPr>
+          <w:sz w:val="19"/>
+          <w:szCs w:val="19"/>
+        </w:rPr>
         <w:t xml:space="preserve">All QUESTION blocks inside the group automatically inherit the shared passage</w:t>
       </w:r>
     </w:p>
@@ -425,7 +442,24 @@
           <w:sz w:val="19"/>
           <w:szCs w:val="19"/>
         </w:rPr>
-        <w:t xml:space="preserve">Each child question can still override taxonomy individually</w:t>
+        <w:t xml:space="preserve">Each child question supports the same bilingual fields as single questions: Question Secondary:, Option A–D Secondary:, Explanation Secondary:</w:t>
+      </w:r>
+    </w:p>
+    <w:p>
+      <w:pPr>
+        <w:pStyle w:val="ListParagraph"/>
+        <w:numPr>
+          <w:ilvl w:val="0"/>
+          <w:numId w:val="1"/>
+        </w:numPr>
+        <w:spacing w:after="40" w:before="40"/>
+      </w:pPr>
+      <w:r>
+        <w:rPr>
+          <w:sz w:val="19"/>
+          <w:szCs w:val="19"/>
+        </w:rPr>
+        <w:t xml:space="preserve">All Secondary fields are optional — mix bilingual and English-only questions freely in the same group</w:t>
       </w:r>
     </w:p>
     <w:p>
@@ -572,7 +606,7 @@
                 <w:sz w:val="17"/>
                 <w:szCs w:val="17"/>
               </w:rPr>
-              <w:t xml:space="preserve">Marks the start of a question block</w:t>
+              <w:t xml:space="preserve">Marks the start of a new question block</w:t>
             </w:r>
           </w:p>
         </w:tc>
@@ -610,7 +644,7 @@
                 <w:sz w:val="17"/>
                 <w:szCs w:val="17"/>
               </w:rPr>
-              <w:t xml:space="preserve">Primary-language question stem (rich text + [IMAGE: URL] supported)</w:t>
+              <w:t xml:space="preserve">Question Stem — Primary Language (rich text + [IMAGE: URL] supported)</w:t>
             </w:r>
           </w:p>
         </w:tc>
@@ -686,7 +720,7 @@
                 <w:sz w:val="17"/>
                 <w:szCs w:val="17"/>
               </w:rPr>
-              <w:t xml:space="preserve">Shared passage HTML ([IMAGE: URL] supported)</w:t>
+              <w:t xml:space="preserve">Passage / Paragraph — Primary Language (rich text + [IMAGE: URL] supported)</w:t>
             </w:r>
           </w:p>
         </w:tc>
@@ -724,7 +758,7 @@
                 <w:sz w:val="17"/>
                 <w:szCs w:val="17"/>
               </w:rPr>
-              <w:t xml:space="preserve">Secondary-language translation of the shared passage</w:t>
+              <w:t xml:space="preserve">Passage / Paragraph — Secondary Language (optional translation)</w:t>
             </w:r>
           </w:p>
         </w:tc>
@@ -800,7 +834,7 @@
                 <w:sz w:val="17"/>
                 <w:szCs w:val="17"/>
               </w:rPr>
-              <w:t xml:space="preserve">Secondary-language question stem (bilingual). Leave blank for English-only.</w:t>
+              <w:t xml:space="preserve">Question Stem — Secondary Language (e.g. Hindi, Telugu). Omit for English-only.</w:t>
             </w:r>
           </w:p>
         </w:tc>
@@ -838,7 +872,7 @@
                 <w:sz w:val="17"/>
                 <w:szCs w:val="17"/>
               </w:rPr>
-              <w:t xml:space="preserve">Primary-language option text (* required for MCQ types)</w:t>
+              <w:t xml:space="preserve">Option A — Primary Language (* required for MCQ types)</w:t>
             </w:r>
           </w:p>
         </w:tc>
@@ -876,7 +910,7 @@
                 <w:sz w:val="17"/>
                 <w:szCs w:val="17"/>
               </w:rPr>
-              <w:t xml:space="preserve">Secondary-language translation of Option A</w:t>
+              <w:t xml:space="preserve">Option A — Secondary Language (optional translation)</w:t>
             </w:r>
           </w:p>
         </w:tc>
@@ -914,7 +948,7 @@
                 <w:sz w:val="17"/>
                 <w:szCs w:val="17"/>
               </w:rPr>
-              <w:t xml:space="preserve">Primary-language option text</w:t>
+              <w:t xml:space="preserve">Option B — Primary Language</w:t>
             </w:r>
           </w:p>
         </w:tc>
@@ -952,7 +986,7 @@
                 <w:sz w:val="17"/>
                 <w:szCs w:val="17"/>
               </w:rPr>
-              <w:t xml:space="preserve">Secondary-language translation of Option B</w:t>
+              <w:t xml:space="preserve">Option B — Secondary Language (optional translation)</w:t>
             </w:r>
           </w:p>
         </w:tc>
@@ -990,7 +1024,7 @@
                 <w:sz w:val="17"/>
                 <w:szCs w:val="17"/>
               </w:rPr>
-              <w:t xml:space="preserve">Primary-language option text</w:t>
+              <w:t xml:space="preserve">Option C — Primary Language</w:t>
             </w:r>
           </w:p>
         </w:tc>
@@ -1028,7 +1062,7 @@
                 <w:sz w:val="17"/>
                 <w:szCs w:val="17"/>
               </w:rPr>
-              <w:t xml:space="preserve">Secondary-language translation of Option C</w:t>
+              <w:t xml:space="preserve">Option C — Secondary Language (optional translation)</w:t>
             </w:r>
           </w:p>
         </w:tc>
@@ -1066,7 +1100,7 @@
                 <w:sz w:val="17"/>
                 <w:szCs w:val="17"/>
               </w:rPr>
-              <w:t xml:space="preserve">Primary-language option text</w:t>
+              <w:t xml:space="preserve">Option D — Primary Language</w:t>
             </w:r>
           </w:p>
         </w:tc>
@@ -1104,7 +1138,7 @@
                 <w:sz w:val="17"/>
                 <w:szCs w:val="17"/>
               </w:rPr>
-              <w:t xml:space="preserve">Secondary-language translation of Option D</w:t>
+              <w:t xml:space="preserve">Option D — Secondary Language (optional translation)</w:t>
             </w:r>
           </w:p>
         </w:tc>
@@ -1142,7 +1176,7 @@
                 <w:sz w:val="17"/>
                 <w:szCs w:val="17"/>
               </w:rPr>
-              <w:t xml:space="preserve">Letter(s): A, B, C or D. Multiple: A,C</w:t>
+              <w:t xml:space="preserve">Letter(s): A, B, C or D. Multiple correct: A,C</w:t>
             </w:r>
           </w:p>
         </w:tc>
@@ -1408,7 +1442,7 @@
                 <w:sz w:val="17"/>
                 <w:szCs w:val="17"/>
               </w:rPr>
-              <w:t xml:space="preserve">Primary-language solution / explanation (rich text + [IMAGE: URL] supported)</w:t>
+              <w:t xml:space="preserve">Explanation (Primary Language) — rich text + [IMAGE: URL] supported</w:t>
             </w:r>
           </w:p>
         </w:tc>
@@ -1446,7 +1480,7 @@
                 <w:sz w:val="17"/>
                 <w:szCs w:val="17"/>
               </w:rPr>
-              <w:t xml:space="preserve">Secondary-language translation of the explanation</w:t>
+              <w:t xml:space="preserve">Explanation — Secondary Language (optional translation)</w:t>
             </w:r>
           </w:p>
         </w:tc>
@@ -1484,7 +1518,7 @@
                 <w:sz w:val="17"/>
                 <w:szCs w:val="17"/>
               </w:rPr>
-              <w:t xml:space="preserve">Comma-separated tags (e.g. source:SBI_PO_2024)</w:t>
+              <w:t xml:space="preserve">Comma-separated tags (e.g. source:SBI_PO_2024, kinematics, newton)</w:t>
             </w:r>
           </w:p>
         </w:tc>
@@ -1522,7 +1556,7 @@
                 <w:sz w:val="17"/>
                 <w:szCs w:val="17"/>
               </w:rPr>
-              <w:t xml:space="preserve">Marks awarded (default: 1)</w:t>
+              <w:t xml:space="preserve">Marks awarded for correct answer (default: 1)</w:t>
             </w:r>
           </w:p>
         </w:tc>
@@ -1694,32 +1728,18 @@
       </w:pPr>
       <w:r>
         <w:rPr>
-          <w:color w:val="6B7280"/>
+          <w:b/>
+          <w:bCs/>
           <w:sz w:val="20"/>
           <w:szCs w:val="20"/>
         </w:rPr>
-        <w:t xml:space="preserve">You can add 'Passage Secondary:' after 'Passage:', and 'Question Secondary:', 'Option A Secondary:', etc. inside each question block. Any fields you omit simply won't have a secondary translation.</w:t>
+        <w:t xml:space="preserve">Bilingual structure inside a group mirrors the single question format exactly:</w:t>
       </w:r>
     </w:p>
     <w:p>
       <w:pPr>
-        <w:pBdr>
-          <w:bottom w:val="single" w:color="E2E8F0" w:sz="1"/>
-        </w:pBdr>
-        <w:spacing w:after="120" w:before="120"/>
-      </w:pPr>
-    </w:p>
-    <w:p>
-      <w:pPr>
-        <w:pStyle w:val="Heading2"/>
-        <w:spacing w:after="80" w:before="240"/>
-        <w:rPr>
-          <w:color w:val="1D4ED8"/>
-        </w:rPr>
-      </w:pPr>
-      <w:r>
-        <w:t xml:space="preserve">Example — Passage with Three Sub-questions (English-only)</w:t>
-      </w:r>
+        <w:spacing w:after="60" w:before="60"/>
+      </w:pPr>
     </w:p>
     <w:tbl>
       <w:tblPr>
@@ -1763,6 +1783,460 @@
                 <w:sz w:val="19"/>
                 <w:szCs w:val="19"/>
               </w:rPr>
+              <w:t xml:space="preserve">Passage:</w:t>
+            </w:r>
+            <w:r>
+              <w:rPr>
+                <w:rFonts w:ascii="Courier New" w:cs="Courier New" w:eastAsia="Courier New" w:hAnsi="Courier New"/>
+                <w:color w:val="1e293b"/>
+                <w:sz w:val="19"/>
+                <w:szCs w:val="19"/>
+              </w:rPr>
+              <w:t xml:space="preserve">  Primary-language passage text</w:t>
+            </w:r>
+          </w:p>
+          <w:p>
+            <w:pPr>
+              <w:shd w:fill="FAFAFA" w:val="clear"/>
+              <w:spacing w:after="30" w:before="30"/>
+              <w:ind w:left="431"/>
+            </w:pPr>
+            <w:r>
+              <w:rPr>
+                <w:rFonts w:ascii="Courier New" w:cs="Courier New" w:eastAsia="Courier New" w:hAnsi="Courier New"/>
+                <w:b/>
+                <w:bCs/>
+                <w:color w:val="7C3AED"/>
+                <w:sz w:val="19"/>
+                <w:szCs w:val="19"/>
+              </w:rPr>
+              <w:t xml:space="preserve">Passage Secondary:</w:t>
+            </w:r>
+            <w:r>
+              <w:rPr>
+                <w:rFonts w:ascii="Courier New" w:cs="Courier New" w:eastAsia="Courier New" w:hAnsi="Courier New"/>
+                <w:color w:val="4338a0"/>
+                <w:sz w:val="19"/>
+                <w:szCs w:val="19"/>
+              </w:rPr>
+              <w:t xml:space="preserve">  Secondary-language translation  ← optional</w:t>
+            </w:r>
+          </w:p>
+          <w:p>
+            <w:pPr>
+              <w:spacing w:after="60" w:before="60"/>
+            </w:pPr>
+          </w:p>
+          <w:p>
+            <w:pPr>
+              <w:shd w:fill="FAFAFA" w:val="clear"/>
+              <w:spacing w:after="30" w:before="30"/>
+              <w:ind w:left="431"/>
+            </w:pPr>
+            <w:r>
+              <w:rPr>
+                <w:rFonts w:ascii="Courier New" w:cs="Courier New" w:eastAsia="Courier New" w:hAnsi="Courier New"/>
+                <w:b/>
+                <w:bCs/>
+                <w:color w:val="7C3AED"/>
+                <w:sz w:val="19"/>
+                <w:szCs w:val="19"/>
+              </w:rPr>
+              <w:t xml:space="preserve">QUESTION</w:t>
+            </w:r>
+            <w:r>
+              <w:rPr>
+                <w:rFonts w:ascii="Courier New" w:cs="Courier New" w:eastAsia="Courier New" w:hAnsi="Courier New"/>
+                <w:color w:val="6B7280"/>
+                <w:sz w:val="19"/>
+                <w:szCs w:val="19"/>
+              </w:rPr>
+              <w:t xml:space="preserve"> </w:t>
+            </w:r>
+          </w:p>
+          <w:p>
+            <w:pPr>
+              <w:shd w:fill="FAFAFA" w:val="clear"/>
+              <w:spacing w:after="30" w:before="30"/>
+              <w:ind w:left="431"/>
+            </w:pPr>
+            <w:r>
+              <w:rPr>
+                <w:rFonts w:ascii="Courier New" w:cs="Courier New" w:eastAsia="Courier New" w:hAnsi="Courier New"/>
+                <w:b/>
+                <w:bCs/>
+                <w:color w:val="7C3AED"/>
+                <w:sz w:val="19"/>
+                <w:szCs w:val="19"/>
+              </w:rPr>
+              <w:t xml:space="preserve">Question:</w:t>
+            </w:r>
+            <w:r>
+              <w:rPr>
+                <w:rFonts w:ascii="Courier New" w:cs="Courier New" w:eastAsia="Courier New" w:hAnsi="Courier New"/>
+                <w:color w:val="1e293b"/>
+                <w:sz w:val="19"/>
+                <w:szCs w:val="19"/>
+              </w:rPr>
+              <w:t xml:space="preserve">  Question Stem (Primary Language)</w:t>
+            </w:r>
+          </w:p>
+          <w:p>
+            <w:pPr>
+              <w:shd w:fill="FAFAFA" w:val="clear"/>
+              <w:spacing w:after="30" w:before="30"/>
+              <w:ind w:left="431"/>
+            </w:pPr>
+            <w:r>
+              <w:rPr>
+                <w:rFonts w:ascii="Courier New" w:cs="Courier New" w:eastAsia="Courier New" w:hAnsi="Courier New"/>
+                <w:b/>
+                <w:bCs/>
+                <w:color w:val="7C3AED"/>
+                <w:sz w:val="19"/>
+                <w:szCs w:val="19"/>
+              </w:rPr>
+              <w:t xml:space="preserve">Question Secondary:</w:t>
+            </w:r>
+            <w:r>
+              <w:rPr>
+                <w:rFonts w:ascii="Courier New" w:cs="Courier New" w:eastAsia="Courier New" w:hAnsi="Courier New"/>
+                <w:color w:val="4338a0"/>
+                <w:sz w:val="19"/>
+                <w:szCs w:val="19"/>
+              </w:rPr>
+              <w:t xml:space="preserve">  Question Stem — Secondary Language  ← optional</w:t>
+            </w:r>
+          </w:p>
+          <w:p>
+            <w:pPr>
+              <w:shd w:fill="FAFAFA" w:val="clear"/>
+              <w:spacing w:after="30" w:before="30"/>
+              <w:ind w:left="431"/>
+            </w:pPr>
+            <w:r>
+              <w:rPr>
+                <w:rFonts w:ascii="Courier New" w:cs="Courier New" w:eastAsia="Courier New" w:hAnsi="Courier New"/>
+                <w:b/>
+                <w:bCs/>
+                <w:color w:val="7C3AED"/>
+                <w:sz w:val="19"/>
+                <w:szCs w:val="19"/>
+              </w:rPr>
+              <w:t xml:space="preserve">Option A:</w:t>
+            </w:r>
+            <w:r>
+              <w:rPr>
+                <w:rFonts w:ascii="Courier New" w:cs="Courier New" w:eastAsia="Courier New" w:hAnsi="Courier New"/>
+                <w:color w:val="1e293b"/>
+                <w:sz w:val="19"/>
+                <w:szCs w:val="19"/>
+              </w:rPr>
+              <w:t xml:space="preserve">  Option text (Primary Language)</w:t>
+            </w:r>
+          </w:p>
+          <w:p>
+            <w:pPr>
+              <w:shd w:fill="FAFAFA" w:val="clear"/>
+              <w:spacing w:after="30" w:before="30"/>
+              <w:ind w:left="431"/>
+            </w:pPr>
+            <w:r>
+              <w:rPr>
+                <w:rFonts w:ascii="Courier New" w:cs="Courier New" w:eastAsia="Courier New" w:hAnsi="Courier New"/>
+                <w:b/>
+                <w:bCs/>
+                <w:color w:val="7C3AED"/>
+                <w:sz w:val="19"/>
+                <w:szCs w:val="19"/>
+              </w:rPr>
+              <w:t xml:space="preserve">Option A Secondary:</w:t>
+            </w:r>
+            <w:r>
+              <w:rPr>
+                <w:rFonts w:ascii="Courier New" w:cs="Courier New" w:eastAsia="Courier New" w:hAnsi="Courier New"/>
+                <w:color w:val="4338a0"/>
+                <w:sz w:val="19"/>
+                <w:szCs w:val="19"/>
+              </w:rPr>
+              <w:t xml:space="preserve">  Option text — Secondary Language  ← optional</w:t>
+            </w:r>
+          </w:p>
+          <w:p>
+            <w:pPr>
+              <w:shd w:fill="FAFAFA" w:val="clear"/>
+              <w:spacing w:after="30" w:before="30"/>
+              <w:ind w:left="431"/>
+            </w:pPr>
+            <w:r>
+              <w:rPr>
+                <w:rFonts w:ascii="Courier New" w:cs="Courier New" w:eastAsia="Courier New" w:hAnsi="Courier New"/>
+                <w:b/>
+                <w:bCs/>
+                <w:color w:val="7C3AED"/>
+                <w:sz w:val="19"/>
+                <w:szCs w:val="19"/>
+              </w:rPr>
+              <w:t xml:space="preserve">Option B:</w:t>
+            </w:r>
+            <w:r>
+              <w:rPr>
+                <w:rFonts w:ascii="Courier New" w:cs="Courier New" w:eastAsia="Courier New" w:hAnsi="Courier New"/>
+                <w:color w:val="1e293b"/>
+                <w:sz w:val="19"/>
+                <w:szCs w:val="19"/>
+              </w:rPr>
+              <w:t xml:space="preserve">  Option text (Primary Language)</w:t>
+            </w:r>
+          </w:p>
+          <w:p>
+            <w:pPr>
+              <w:shd w:fill="FAFAFA" w:val="clear"/>
+              <w:spacing w:after="30" w:before="30"/>
+              <w:ind w:left="431"/>
+            </w:pPr>
+            <w:r>
+              <w:rPr>
+                <w:rFonts w:ascii="Courier New" w:cs="Courier New" w:eastAsia="Courier New" w:hAnsi="Courier New"/>
+                <w:b/>
+                <w:bCs/>
+                <w:color w:val="7C3AED"/>
+                <w:sz w:val="19"/>
+                <w:szCs w:val="19"/>
+              </w:rPr>
+              <w:t xml:space="preserve">Option B Secondary:</w:t>
+            </w:r>
+            <w:r>
+              <w:rPr>
+                <w:rFonts w:ascii="Courier New" w:cs="Courier New" w:eastAsia="Courier New" w:hAnsi="Courier New"/>
+                <w:color w:val="4338a0"/>
+                <w:sz w:val="19"/>
+                <w:szCs w:val="19"/>
+              </w:rPr>
+              <w:t xml:space="preserve">  Option text — Secondary Language  ← optional</w:t>
+            </w:r>
+          </w:p>
+          <w:p>
+            <w:pPr>
+              <w:shd w:fill="FAFAFA" w:val="clear"/>
+              <w:spacing w:after="30" w:before="30"/>
+              <w:ind w:left="431"/>
+            </w:pPr>
+            <w:r>
+              <w:rPr>
+                <w:rFonts w:ascii="Courier New" w:cs="Courier New" w:eastAsia="Courier New" w:hAnsi="Courier New"/>
+                <w:b/>
+                <w:bCs/>
+                <w:color w:val="7C3AED"/>
+                <w:sz w:val="19"/>
+                <w:szCs w:val="19"/>
+              </w:rPr>
+              <w:t xml:space="preserve">Correct Answer:</w:t>
+            </w:r>
+            <w:r>
+              <w:rPr>
+                <w:rFonts w:ascii="Courier New" w:cs="Courier New" w:eastAsia="Courier New" w:hAnsi="Courier New"/>
+                <w:color w:val="065F46"/>
+                <w:sz w:val="19"/>
+                <w:szCs w:val="19"/>
+              </w:rPr>
+              <w:t xml:space="preserve">  A</w:t>
+            </w:r>
+          </w:p>
+          <w:p>
+            <w:pPr>
+              <w:shd w:fill="FAFAFA" w:val="clear"/>
+              <w:spacing w:after="30" w:before="30"/>
+              <w:ind w:left="431"/>
+            </w:pPr>
+            <w:r>
+              <w:rPr>
+                <w:rFonts w:ascii="Courier New" w:cs="Courier New" w:eastAsia="Courier New" w:hAnsi="Courier New"/>
+                <w:b/>
+                <w:bCs/>
+                <w:color w:val="7C3AED"/>
+                <w:sz w:val="19"/>
+                <w:szCs w:val="19"/>
+              </w:rPr>
+              <w:t xml:space="preserve">Difficulty:</w:t>
+            </w:r>
+            <w:r>
+              <w:rPr>
+                <w:rFonts w:ascii="Courier New" w:cs="Courier New" w:eastAsia="Courier New" w:hAnsi="Courier New"/>
+                <w:color w:val="6B7280"/>
+                <w:sz w:val="19"/>
+                <w:szCs w:val="19"/>
+              </w:rPr>
+              <w:t xml:space="preserve">  MEDIUM</w:t>
+            </w:r>
+          </w:p>
+          <w:p>
+            <w:pPr>
+              <w:shd w:fill="FAFAFA" w:val="clear"/>
+              <w:spacing w:after="30" w:before="30"/>
+              <w:ind w:left="431"/>
+            </w:pPr>
+            <w:r>
+              <w:rPr>
+                <w:rFonts w:ascii="Courier New" w:cs="Courier New" w:eastAsia="Courier New" w:hAnsi="Courier New"/>
+                <w:b/>
+                <w:bCs/>
+                <w:color w:val="7C3AED"/>
+                <w:sz w:val="19"/>
+                <w:szCs w:val="19"/>
+              </w:rPr>
+              <w:t xml:space="preserve">Explanation:</w:t>
+            </w:r>
+            <w:r>
+              <w:rPr>
+                <w:rFonts w:ascii="Courier New" w:cs="Courier New" w:eastAsia="Courier New" w:hAnsi="Courier New"/>
+                <w:color w:val="1e293b"/>
+                <w:sz w:val="19"/>
+                <w:szCs w:val="19"/>
+              </w:rPr>
+              <w:t xml:space="preserve">  Explanation (Primary Language)</w:t>
+            </w:r>
+          </w:p>
+          <w:p>
+            <w:pPr>
+              <w:shd w:fill="FAFAFA" w:val="clear"/>
+              <w:spacing w:after="30" w:before="30"/>
+              <w:ind w:left="431"/>
+            </w:pPr>
+            <w:r>
+              <w:rPr>
+                <w:rFonts w:ascii="Courier New" w:cs="Courier New" w:eastAsia="Courier New" w:hAnsi="Courier New"/>
+                <w:b/>
+                <w:bCs/>
+                <w:color w:val="7C3AED"/>
+                <w:sz w:val="19"/>
+                <w:szCs w:val="19"/>
+              </w:rPr>
+              <w:t xml:space="preserve">Explanation Secondary:</w:t>
+            </w:r>
+            <w:r>
+              <w:rPr>
+                <w:rFonts w:ascii="Courier New" w:cs="Courier New" w:eastAsia="Courier New" w:hAnsi="Courier New"/>
+                <w:color w:val="4338a0"/>
+                <w:sz w:val="19"/>
+                <w:szCs w:val="19"/>
+              </w:rPr>
+              <w:t xml:space="preserve">  Explanation — Secondary Language  ← optional</w:t>
+            </w:r>
+          </w:p>
+          <w:p>
+            <w:pPr>
+              <w:shd w:fill="FAFAFA" w:val="clear"/>
+              <w:spacing w:after="30" w:before="30"/>
+              <w:ind w:left="431"/>
+            </w:pPr>
+            <w:r>
+              <w:rPr>
+                <w:rFonts w:ascii="Courier New" w:cs="Courier New" w:eastAsia="Courier New" w:hAnsi="Courier New"/>
+                <w:b/>
+                <w:bCs/>
+                <w:color w:val="7C3AED"/>
+                <w:sz w:val="19"/>
+                <w:szCs w:val="19"/>
+              </w:rPr>
+              <w:t xml:space="preserve">END_QUESTION</w:t>
+            </w:r>
+            <w:r>
+              <w:rPr>
+                <w:rFonts w:ascii="Courier New" w:cs="Courier New" w:eastAsia="Courier New" w:hAnsi="Courier New"/>
+                <w:color w:val="6B7280"/>
+                <w:sz w:val="19"/>
+                <w:szCs w:val="19"/>
+              </w:rPr>
+              <w:t xml:space="preserve"> </w:t>
+            </w:r>
+          </w:p>
+        </w:tc>
+      </w:tr>
+    </w:tbl>
+    <w:p>
+      <w:pPr>
+        <w:spacing w:after="60" w:before="60"/>
+      </w:pPr>
+    </w:p>
+    <w:p>
+      <w:pPr>
+        <w:spacing w:after="60" w:before="60"/>
+        <w:ind w:left="288"/>
+      </w:pPr>
+      <w:r>
+        <w:rPr>
+          <w:i/>
+          <w:iCs/>
+          <w:color w:val="1D4ED8"/>
+          <w:sz w:val="18"/>
+          <w:szCs w:val="18"/>
+        </w:rPr>
+        <w:t xml:space="preserve">ℹ️  Add Secondary fields for any combination you need: just the passage, just certain questions, or the full set. Omitting any Secondary field is never an error.</w:t>
+      </w:r>
+    </w:p>
+    <w:p>
+      <w:pPr>
+        <w:pBdr>
+          <w:bottom w:val="single" w:color="E2E8F0" w:sz="1"/>
+        </w:pBdr>
+        <w:spacing w:after="120" w:before="120"/>
+      </w:pPr>
+    </w:p>
+    <w:p>
+      <w:pPr>
+        <w:pStyle w:val="Heading2"/>
+        <w:spacing w:after="80" w:before="240"/>
+        <w:rPr>
+          <w:color w:val="1D4ED8"/>
+        </w:rPr>
+      </w:pPr>
+      <w:r>
+        <w:t xml:space="preserve">Example A — English-only Group (no bilingual fields)</w:t>
+      </w:r>
+    </w:p>
+    <w:tbl>
+      <w:tblPr>
+        <w:tblW w:type="pct" w:w="100%"/>
+        <w:tblBorders>
+          <w:top w:val="single" w:color="auto" w:sz="4"/>
+          <w:left w:val="single" w:color="auto" w:sz="4"/>
+          <w:bottom w:val="single" w:color="auto" w:sz="4"/>
+          <w:right w:val="single" w:color="auto" w:sz="4"/>
+          <w:insideH w:val="single" w:color="auto" w:sz="4"/>
+          <w:insideV w:val="single" w:color="auto" w:sz="4"/>
+        </w:tblBorders>
+      </w:tblPr>
+      <w:tblGrid>
+        <w:gridCol w:w="100"/>
+      </w:tblGrid>
+      <w:tr>
+        <w:tc>
+          <w:tcPr>
+            <w:tcW w:type="pct" w:w="100%"/>
+            <w:tcBorders>
+              <w:top w:val="single" w:color="7C3AED" w:sz="2"/>
+              <w:left w:val="single" w:color="7C3AED" w:sz="2"/>
+              <w:bottom w:val="single" w:color="7C3AED" w:sz="2"/>
+              <w:right w:val="single" w:color="7C3AED" w:sz="2"/>
+            </w:tcBorders>
+            <w:shd w:fill="F8F4FF" w:val="clear"/>
+          </w:tcPr>
+          <w:p>
+            <w:pPr>
+              <w:shd w:fill="FAFAFA" w:val="clear"/>
+              <w:spacing w:after="30" w:before="30"/>
+              <w:ind w:left="431"/>
+            </w:pPr>
+            <w:r>
+              <w:rPr>
+                <w:rFonts w:ascii="Courier New" w:cs="Courier New" w:eastAsia="Courier New" w:hAnsi="Courier New"/>
+                <w:b/>
+                <w:bCs/>
+                <w:color w:val="7C3AED"/>
+                <w:sz w:val="19"/>
+                <w:szCs w:val="19"/>
+              </w:rPr>
               <w:t xml:space="preserve">GROUP_START</w:t>
             </w:r>
             <w:r>
@@ -2139,6 +2613,33 @@
                 <w:sz w:val="19"/>
                 <w:szCs w:val="19"/>
               </w:rPr>
+              <w:t xml:space="preserve">Type:</w:t>
+            </w:r>
+            <w:r>
+              <w:rPr>
+                <w:rFonts w:ascii="Courier New" w:cs="Courier New" w:eastAsia="Courier New" w:hAnsi="Courier New"/>
+                <w:color w:val="6B7280"/>
+                <w:sz w:val="19"/>
+                <w:szCs w:val="19"/>
+              </w:rPr>
+              <w:t xml:space="preserve">  MCQ_SINGLE</w:t>
+            </w:r>
+          </w:p>
+          <w:p>
+            <w:pPr>
+              <w:shd w:fill="FAFAFA" w:val="clear"/>
+              <w:spacing w:after="30" w:before="30"/>
+              <w:ind w:left="431"/>
+            </w:pPr>
+            <w:r>
+              <w:rPr>
+                <w:rFonts w:ascii="Courier New" w:cs="Courier New" w:eastAsia="Courier New" w:hAnsi="Courier New"/>
+                <w:b/>
+                <w:bCs/>
+                <w:color w:val="7C3AED"/>
+                <w:sz w:val="19"/>
+                <w:szCs w:val="19"/>
+              </w:rPr>
               <w:t xml:space="preserve">Difficulty:</w:t>
             </w:r>
             <w:r>
@@ -2261,7 +2762,7 @@
                 <w:sz w:val="19"/>
                 <w:szCs w:val="19"/>
               </w:rPr>
-              <w:t xml:space="preserve">  What is the approximate percentage increase in production from 2020 to 2021?</w:t>
+              <w:t xml:space="preserve">  Which year recorded the lowest production?</w:t>
             </w:r>
           </w:p>
           <w:p>
@@ -2288,7 +2789,7 @@
                 <w:sz w:val="19"/>
                 <w:szCs w:val="19"/>
               </w:rPr>
-              <w:t xml:space="preserve">  10%</w:t>
+              <w:t xml:space="preserve">  2019</w:t>
             </w:r>
           </w:p>
           <w:p>
@@ -2315,7 +2816,7 @@
                 <w:sz w:val="19"/>
                 <w:szCs w:val="19"/>
               </w:rPr>
-              <w:t xml:space="preserve">  15%</w:t>
+              <w:t xml:space="preserve">  2020</w:t>
             </w:r>
           </w:p>
           <w:p>
@@ -2342,7 +2843,7 @@
                 <w:sz w:val="19"/>
                 <w:szCs w:val="19"/>
               </w:rPr>
-              <w:t xml:space="preserve">  20%</w:t>
+              <w:t xml:space="preserve">  2022</w:t>
             </w:r>
           </w:p>
           <w:p>
@@ -2369,7 +2870,7 @@
                 <w:sz w:val="19"/>
                 <w:szCs w:val="19"/>
               </w:rPr>
-              <w:t xml:space="preserve">  25%</w:t>
+              <w:t xml:space="preserve">  2023</w:t>
             </w:r>
           </w:p>
           <w:p>
@@ -2396,6 +2897,725 @@
                 <w:sz w:val="19"/>
                 <w:szCs w:val="19"/>
               </w:rPr>
+              <w:t xml:space="preserve">  A</w:t>
+            </w:r>
+          </w:p>
+          <w:p>
+            <w:pPr>
+              <w:shd w:fill="FAFAFA" w:val="clear"/>
+              <w:spacing w:after="30" w:before="30"/>
+              <w:ind w:left="431"/>
+            </w:pPr>
+            <w:r>
+              <w:rPr>
+                <w:rFonts w:ascii="Courier New" w:cs="Courier New" w:eastAsia="Courier New" w:hAnsi="Courier New"/>
+                <w:b/>
+                <w:bCs/>
+                <w:color w:val="7C3AED"/>
+                <w:sz w:val="19"/>
+                <w:szCs w:val="19"/>
+              </w:rPr>
+              <w:t xml:space="preserve">Type:</w:t>
+            </w:r>
+            <w:r>
+              <w:rPr>
+                <w:rFonts w:ascii="Courier New" w:cs="Courier New" w:eastAsia="Courier New" w:hAnsi="Courier New"/>
+                <w:color w:val="6B7280"/>
+                <w:sz w:val="19"/>
+                <w:szCs w:val="19"/>
+              </w:rPr>
+              <w:t xml:space="preserve">  MCQ_SINGLE</w:t>
+            </w:r>
+          </w:p>
+          <w:p>
+            <w:pPr>
+              <w:shd w:fill="FAFAFA" w:val="clear"/>
+              <w:spacing w:after="30" w:before="30"/>
+              <w:ind w:left="431"/>
+            </w:pPr>
+            <w:r>
+              <w:rPr>
+                <w:rFonts w:ascii="Courier New" w:cs="Courier New" w:eastAsia="Courier New" w:hAnsi="Courier New"/>
+                <w:b/>
+                <w:bCs/>
+                <w:color w:val="7C3AED"/>
+                <w:sz w:val="19"/>
+                <w:szCs w:val="19"/>
+              </w:rPr>
+              <w:t xml:space="preserve">Difficulty:</w:t>
+            </w:r>
+            <w:r>
+              <w:rPr>
+                <w:rFonts w:ascii="Courier New" w:cs="Courier New" w:eastAsia="Courier New" w:hAnsi="Courier New"/>
+                <w:color w:val="6B7280"/>
+                <w:sz w:val="19"/>
+                <w:szCs w:val="19"/>
+              </w:rPr>
+              <w:t xml:space="preserve">  EASY</w:t>
+            </w:r>
+          </w:p>
+          <w:p>
+            <w:pPr>
+              <w:shd w:fill="FAFAFA" w:val="clear"/>
+              <w:spacing w:after="30" w:before="30"/>
+              <w:ind w:left="431"/>
+            </w:pPr>
+            <w:r>
+              <w:rPr>
+                <w:rFonts w:ascii="Courier New" w:cs="Courier New" w:eastAsia="Courier New" w:hAnsi="Courier New"/>
+                <w:b/>
+                <w:bCs/>
+                <w:color w:val="7C3AED"/>
+                <w:sz w:val="19"/>
+                <w:szCs w:val="19"/>
+              </w:rPr>
+              <w:t xml:space="preserve">Explanation:</w:t>
+            </w:r>
+            <w:r>
+              <w:rPr>
+                <w:rFonts w:ascii="Courier New" w:cs="Courier New" w:eastAsia="Courier New" w:hAnsi="Courier New"/>
+                <w:color w:val="6B7280"/>
+                <w:sz w:val="19"/>
+                <w:szCs w:val="19"/>
+              </w:rPr>
+              <w:t xml:space="preserve">  2019 had the lowest bar in the chart.</w:t>
+            </w:r>
+          </w:p>
+          <w:p>
+            <w:pPr>
+              <w:shd w:fill="FAFAFA" w:val="clear"/>
+              <w:spacing w:after="30" w:before="30"/>
+              <w:ind w:left="431"/>
+            </w:pPr>
+            <w:r>
+              <w:rPr>
+                <w:rFonts w:ascii="Courier New" w:cs="Courier New" w:eastAsia="Courier New" w:hAnsi="Courier New"/>
+                <w:b/>
+                <w:bCs/>
+                <w:color w:val="7C3AED"/>
+                <w:sz w:val="19"/>
+                <w:szCs w:val="19"/>
+              </w:rPr>
+              <w:t xml:space="preserve">END_QUESTION</w:t>
+            </w:r>
+            <w:r>
+              <w:rPr>
+                <w:rFonts w:ascii="Courier New" w:cs="Courier New" w:eastAsia="Courier New" w:hAnsi="Courier New"/>
+                <w:color w:val="6B7280"/>
+                <w:sz w:val="19"/>
+                <w:szCs w:val="19"/>
+              </w:rPr>
+              <w:t xml:space="preserve"> </w:t>
+            </w:r>
+          </w:p>
+          <w:p>
+            <w:pPr>
+              <w:shd w:fill="FAFAFA" w:val="clear"/>
+              <w:spacing w:after="30" w:before="30"/>
+              <w:ind w:left="431"/>
+            </w:pPr>
+            <w:r>
+              <w:rPr>
+                <w:rFonts w:ascii="Courier New" w:cs="Courier New" w:eastAsia="Courier New" w:hAnsi="Courier New"/>
+                <w:b/>
+                <w:bCs/>
+                <w:color w:val="7C3AED"/>
+                <w:sz w:val="19"/>
+                <w:szCs w:val="19"/>
+              </w:rPr>
+              <w:t xml:space="preserve">GROUP_END</w:t>
+            </w:r>
+            <w:r>
+              <w:rPr>
+                <w:rFonts w:ascii="Courier New" w:cs="Courier New" w:eastAsia="Courier New" w:hAnsi="Courier New"/>
+                <w:color w:val="6B7280"/>
+                <w:sz w:val="19"/>
+                <w:szCs w:val="19"/>
+              </w:rPr>
+              <w:t xml:space="preserve"> </w:t>
+            </w:r>
+          </w:p>
+        </w:tc>
+      </w:tr>
+    </w:tbl>
+    <w:p>
+      <w:pPr>
+        <w:spacing w:after="60" w:before="60"/>
+      </w:pPr>
+    </w:p>
+    <w:p>
+      <w:pPr>
+        <w:pStyle w:val="Heading2"/>
+        <w:spacing w:after="80" w:before="240"/>
+        <w:rPr>
+          <w:color w:val="1D4ED8"/>
+        </w:rPr>
+      </w:pPr>
+      <w:r>
+        <w:t xml:space="preserve">Example B — Full Bilingual Group (English + Hindi)</w:t>
+      </w:r>
+    </w:p>
+    <w:p>
+      <w:pPr>
+        <w:spacing w:after="60" w:before="60"/>
+        <w:ind w:left="288"/>
+      </w:pPr>
+      <w:r>
+        <w:rPr>
+          <w:i/>
+          <w:iCs/>
+          <w:color w:val="1D4ED8"/>
+          <w:sz w:val="18"/>
+          <w:szCs w:val="18"/>
+        </w:rPr>
+        <w:t xml:space="preserve">ℹ️  Secondary fields (shown in indigo) are placed immediately after their primary counterpart — same pattern as single questions.</w:t>
+      </w:r>
+    </w:p>
+    <w:p>
+      <w:pPr>
+        <w:spacing w:after="60" w:before="60"/>
+      </w:pPr>
+    </w:p>
+    <w:tbl>
+      <w:tblPr>
+        <w:tblW w:type="pct" w:w="100%"/>
+        <w:tblBorders>
+          <w:top w:val="single" w:color="auto" w:sz="4"/>
+          <w:left w:val="single" w:color="auto" w:sz="4"/>
+          <w:bottom w:val="single" w:color="auto" w:sz="4"/>
+          <w:right w:val="single" w:color="auto" w:sz="4"/>
+          <w:insideH w:val="single" w:color="auto" w:sz="4"/>
+          <w:insideV w:val="single" w:color="auto" w:sz="4"/>
+        </w:tblBorders>
+      </w:tblPr>
+      <w:tblGrid>
+        <w:gridCol w:w="100"/>
+      </w:tblGrid>
+      <w:tr>
+        <w:tc>
+          <w:tcPr>
+            <w:tcW w:type="pct" w:w="100%"/>
+            <w:tcBorders>
+              <w:top w:val="single" w:color="7C3AED" w:sz="2"/>
+              <w:left w:val="single" w:color="7C3AED" w:sz="2"/>
+              <w:bottom w:val="single" w:color="7C3AED" w:sz="2"/>
+              <w:right w:val="single" w:color="7C3AED" w:sz="2"/>
+            </w:tcBorders>
+            <w:shd w:fill="F8F4FF" w:val="clear"/>
+          </w:tcPr>
+          <w:p>
+            <w:pPr>
+              <w:shd w:fill="FAFAFA" w:val="clear"/>
+              <w:spacing w:after="30" w:before="30"/>
+              <w:ind w:left="431"/>
+            </w:pPr>
+            <w:r>
+              <w:rPr>
+                <w:rFonts w:ascii="Courier New" w:cs="Courier New" w:eastAsia="Courier New" w:hAnsi="Courier New"/>
+                <w:b/>
+                <w:bCs/>
+                <w:color w:val="7C3AED"/>
+                <w:sz w:val="19"/>
+                <w:szCs w:val="19"/>
+              </w:rPr>
+              <w:t xml:space="preserve">GROUP_START</w:t>
+            </w:r>
+            <w:r>
+              <w:rPr>
+                <w:rFonts w:ascii="Courier New" w:cs="Courier New" w:eastAsia="Courier New" w:hAnsi="Courier New"/>
+                <w:color w:val="6B7280"/>
+                <w:sz w:val="19"/>
+                <w:szCs w:val="19"/>
+              </w:rPr>
+              <w:t xml:space="preserve"> </w:t>
+            </w:r>
+          </w:p>
+          <w:p>
+            <w:pPr>
+              <w:shd w:fill="FAFAFA" w:val="clear"/>
+              <w:spacing w:after="30" w:before="30"/>
+              <w:ind w:left="431"/>
+            </w:pPr>
+            <w:r>
+              <w:rPr>
+                <w:rFonts w:ascii="Courier New" w:cs="Courier New" w:eastAsia="Courier New" w:hAnsi="Courier New"/>
+                <w:b/>
+                <w:bCs/>
+                <w:color w:val="7C3AED"/>
+                <w:sz w:val="19"/>
+                <w:szCs w:val="19"/>
+              </w:rPr>
+              <w:t xml:space="preserve">Category:</w:t>
+            </w:r>
+            <w:r>
+              <w:rPr>
+                <w:rFonts w:ascii="Courier New" w:cs="Courier New" w:eastAsia="Courier New" w:hAnsi="Courier New"/>
+                <w:color w:val="6B7280"/>
+                <w:sz w:val="19"/>
+                <w:szCs w:val="19"/>
+              </w:rPr>
+              <w:t xml:space="preserve">  Banking</w:t>
+            </w:r>
+          </w:p>
+          <w:p>
+            <w:pPr>
+              <w:shd w:fill="FAFAFA" w:val="clear"/>
+              <w:spacing w:after="30" w:before="30"/>
+              <w:ind w:left="431"/>
+            </w:pPr>
+            <w:r>
+              <w:rPr>
+                <w:rFonts w:ascii="Courier New" w:cs="Courier New" w:eastAsia="Courier New" w:hAnsi="Courier New"/>
+                <w:b/>
+                <w:bCs/>
+                <w:color w:val="7C3AED"/>
+                <w:sz w:val="19"/>
+                <w:szCs w:val="19"/>
+              </w:rPr>
+              <w:t xml:space="preserve">Subject:</w:t>
+            </w:r>
+            <w:r>
+              <w:rPr>
+                <w:rFonts w:ascii="Courier New" w:cs="Courier New" w:eastAsia="Courier New" w:hAnsi="Courier New"/>
+                <w:color w:val="6B7280"/>
+                <w:sz w:val="19"/>
+                <w:szCs w:val="19"/>
+              </w:rPr>
+              <w:t xml:space="preserve">  English Comprehension</w:t>
+            </w:r>
+          </w:p>
+          <w:p>
+            <w:pPr>
+              <w:shd w:fill="FAFAFA" w:val="clear"/>
+              <w:spacing w:after="30" w:before="30"/>
+              <w:ind w:left="431"/>
+            </w:pPr>
+            <w:r>
+              <w:rPr>
+                <w:rFonts w:ascii="Courier New" w:cs="Courier New" w:eastAsia="Courier New" w:hAnsi="Courier New"/>
+                <w:b/>
+                <w:bCs/>
+                <w:color w:val="7C3AED"/>
+                <w:sz w:val="19"/>
+                <w:szCs w:val="19"/>
+              </w:rPr>
+              <w:t xml:space="preserve">Topic:</w:t>
+            </w:r>
+            <w:r>
+              <w:rPr>
+                <w:rFonts w:ascii="Courier New" w:cs="Courier New" w:eastAsia="Courier New" w:hAnsi="Courier New"/>
+                <w:color w:val="6B7280"/>
+                <w:sz w:val="19"/>
+                <w:szCs w:val="19"/>
+              </w:rPr>
+              <w:t xml:space="preserve">  Reading</w:t>
+            </w:r>
+          </w:p>
+          <w:p>
+            <w:pPr>
+              <w:shd w:fill="FAFAFA" w:val="clear"/>
+              <w:spacing w:after="30" w:before="30"/>
+              <w:ind w:left="431"/>
+            </w:pPr>
+            <w:r>
+              <w:rPr>
+                <w:rFonts w:ascii="Courier New" w:cs="Courier New" w:eastAsia="Courier New" w:hAnsi="Courier New"/>
+                <w:b/>
+                <w:bCs/>
+                <w:color w:val="7C3AED"/>
+                <w:sz w:val="19"/>
+                <w:szCs w:val="19"/>
+              </w:rPr>
+              <w:t xml:space="preserve">Subtopic:</w:t>
+            </w:r>
+            <w:r>
+              <w:rPr>
+                <w:rFonts w:ascii="Courier New" w:cs="Courier New" w:eastAsia="Courier New" w:hAnsi="Courier New"/>
+                <w:color w:val="6B7280"/>
+                <w:sz w:val="19"/>
+                <w:szCs w:val="19"/>
+              </w:rPr>
+              <w:t xml:space="preserve">  Short Passages</w:t>
+            </w:r>
+          </w:p>
+          <w:p>
+            <w:pPr>
+              <w:spacing w:after="30" w:before="30"/>
+              <w:ind w:left="431"/>
+            </w:pPr>
+            <w:r>
+              <w:rPr>
+                <w:rFonts w:ascii="Courier New" w:cs="Courier New" w:eastAsia="Courier New" w:hAnsi="Courier New"/>
+                <w:b/>
+                <w:bCs/>
+                <w:color w:val="7C3AED"/>
+                <w:sz w:val="19"/>
+                <w:szCs w:val="19"/>
+              </w:rPr>
+              <w:t xml:space="preserve">Passage: </w:t>
+            </w:r>
+            <w:r>
+              <w:rPr>
+                <w:rFonts w:ascii="Courier New" w:cs="Courier New" w:eastAsia="Courier New" w:hAnsi="Courier New"/>
+                <w:color w:val="1e293b"/>
+                <w:sz w:val="19"/>
+                <w:szCs w:val="19"/>
+              </w:rPr>
+              <w:t xml:space="preserve"> Scientists have discovered that sleep plays a vital role in memory consolidation.</w:t>
+            </w:r>
+          </w:p>
+          <w:p>
+            <w:pPr>
+              <w:spacing w:after="30" w:before="30"/>
+              <w:ind w:left="431"/>
+            </w:pPr>
+            <w:r>
+              <w:rPr>
+                <w:rFonts w:ascii="Courier New" w:cs="Courier New" w:eastAsia="Courier New" w:hAnsi="Courier New"/>
+                <w:b/>
+                <w:bCs/>
+                <w:color w:val="4338a0"/>
+                <w:sz w:val="19"/>
+                <w:szCs w:val="19"/>
+              </w:rPr>
+              <w:t xml:space="preserve">Passage Secondary: </w:t>
+            </w:r>
+            <w:r>
+              <w:rPr>
+                <w:rFonts w:ascii="Courier New" w:cs="Courier New" w:eastAsia="Courier New" w:hAnsi="Courier New"/>
+                <w:color w:val="4338a0"/>
+                <w:sz w:val="19"/>
+                <w:szCs w:val="19"/>
+              </w:rPr>
+              <w:t xml:space="preserve"> वैज्ञानिकों ने खोज की है कि नींद स्मृति समेकन में महत्वपूर्ण भूमिका निभाती है।</w:t>
+            </w:r>
+          </w:p>
+          <w:p>
+            <w:pPr>
+              <w:spacing w:after="60" w:before="60"/>
+            </w:pPr>
+          </w:p>
+          <w:p>
+            <w:pPr>
+              <w:shd w:fill="FAFAFA" w:val="clear"/>
+              <w:spacing w:after="30" w:before="30"/>
+              <w:ind w:left="431"/>
+            </w:pPr>
+            <w:r>
+              <w:rPr>
+                <w:rFonts w:ascii="Courier New" w:cs="Courier New" w:eastAsia="Courier New" w:hAnsi="Courier New"/>
+                <w:b/>
+                <w:bCs/>
+                <w:color w:val="7C3AED"/>
+                <w:sz w:val="19"/>
+                <w:szCs w:val="19"/>
+              </w:rPr>
+              <w:t xml:space="preserve">QUESTION</w:t>
+            </w:r>
+            <w:r>
+              <w:rPr>
+                <w:rFonts w:ascii="Courier New" w:cs="Courier New" w:eastAsia="Courier New" w:hAnsi="Courier New"/>
+                <w:color w:val="6B7280"/>
+                <w:sz w:val="19"/>
+                <w:szCs w:val="19"/>
+              </w:rPr>
+              <w:t xml:space="preserve"> </w:t>
+            </w:r>
+          </w:p>
+          <w:p>
+            <w:pPr>
+              <w:shd w:fill="FAFAFA" w:val="clear"/>
+              <w:spacing w:after="30" w:before="30"/>
+              <w:ind w:left="431"/>
+            </w:pPr>
+            <w:r>
+              <w:rPr>
+                <w:rFonts w:ascii="Courier New" w:cs="Courier New" w:eastAsia="Courier New" w:hAnsi="Courier New"/>
+                <w:b/>
+                <w:bCs/>
+                <w:color w:val="7C3AED"/>
+                <w:sz w:val="19"/>
+                <w:szCs w:val="19"/>
+              </w:rPr>
+              <w:t xml:space="preserve">Question:</w:t>
+            </w:r>
+            <w:r>
+              <w:rPr>
+                <w:rFonts w:ascii="Courier New" w:cs="Courier New" w:eastAsia="Courier New" w:hAnsi="Courier New"/>
+                <w:color w:val="1e293b"/>
+                <w:sz w:val="19"/>
+                <w:szCs w:val="19"/>
+              </w:rPr>
+              <w:t xml:space="preserve">  According to the passage, what role does sleep play?</w:t>
+            </w:r>
+          </w:p>
+          <w:p>
+            <w:pPr>
+              <w:shd w:fill="FAFAFA" w:val="clear"/>
+              <w:spacing w:after="30" w:before="30"/>
+              <w:ind w:left="431"/>
+            </w:pPr>
+            <w:r>
+              <w:rPr>
+                <w:rFonts w:ascii="Courier New" w:cs="Courier New" w:eastAsia="Courier New" w:hAnsi="Courier New"/>
+                <w:b/>
+                <w:bCs/>
+                <w:color w:val="7C3AED"/>
+                <w:sz w:val="19"/>
+                <w:szCs w:val="19"/>
+              </w:rPr>
+              <w:t xml:space="preserve">Question Secondary:</w:t>
+            </w:r>
+            <w:r>
+              <w:rPr>
+                <w:rFonts w:ascii="Courier New" w:cs="Courier New" w:eastAsia="Courier New" w:hAnsi="Courier New"/>
+                <w:color w:val="4338a0"/>
+                <w:sz w:val="19"/>
+                <w:szCs w:val="19"/>
+              </w:rPr>
+              <w:t xml:space="preserve">  गद्यांश के अनुसार, नींद क्या भूमिका निभाती है?</w:t>
+            </w:r>
+          </w:p>
+          <w:p>
+            <w:pPr>
+              <w:shd w:fill="FAFAFA" w:val="clear"/>
+              <w:spacing w:after="30" w:before="30"/>
+              <w:ind w:left="431"/>
+            </w:pPr>
+            <w:r>
+              <w:rPr>
+                <w:rFonts w:ascii="Courier New" w:cs="Courier New" w:eastAsia="Courier New" w:hAnsi="Courier New"/>
+                <w:b/>
+                <w:bCs/>
+                <w:color w:val="7C3AED"/>
+                <w:sz w:val="19"/>
+                <w:szCs w:val="19"/>
+              </w:rPr>
+              <w:t xml:space="preserve">Option A:</w:t>
+            </w:r>
+            <w:r>
+              <w:rPr>
+                <w:rFonts w:ascii="Courier New" w:cs="Courier New" w:eastAsia="Courier New" w:hAnsi="Courier New"/>
+                <w:color w:val="1e293b"/>
+                <w:sz w:val="19"/>
+                <w:szCs w:val="19"/>
+              </w:rPr>
+              <w:t xml:space="preserve">  Improves physical strength</w:t>
+            </w:r>
+          </w:p>
+          <w:p>
+            <w:pPr>
+              <w:shd w:fill="FAFAFA" w:val="clear"/>
+              <w:spacing w:after="30" w:before="30"/>
+              <w:ind w:left="431"/>
+            </w:pPr>
+            <w:r>
+              <w:rPr>
+                <w:rFonts w:ascii="Courier New" w:cs="Courier New" w:eastAsia="Courier New" w:hAnsi="Courier New"/>
+                <w:b/>
+                <w:bCs/>
+                <w:color w:val="7C3AED"/>
+                <w:sz w:val="19"/>
+                <w:szCs w:val="19"/>
+              </w:rPr>
+              <w:t xml:space="preserve">Option A Secondary:</w:t>
+            </w:r>
+            <w:r>
+              <w:rPr>
+                <w:rFonts w:ascii="Courier New" w:cs="Courier New" w:eastAsia="Courier New" w:hAnsi="Courier New"/>
+                <w:color w:val="4338a0"/>
+                <w:sz w:val="19"/>
+                <w:szCs w:val="19"/>
+              </w:rPr>
+              <w:t xml:space="preserve">  शारीरिक शक्ति में सुधार करती है</w:t>
+            </w:r>
+          </w:p>
+          <w:p>
+            <w:pPr>
+              <w:shd w:fill="FAFAFA" w:val="clear"/>
+              <w:spacing w:after="30" w:before="30"/>
+              <w:ind w:left="431"/>
+            </w:pPr>
+            <w:r>
+              <w:rPr>
+                <w:rFonts w:ascii="Courier New" w:cs="Courier New" w:eastAsia="Courier New" w:hAnsi="Courier New"/>
+                <w:b/>
+                <w:bCs/>
+                <w:color w:val="7C3AED"/>
+                <w:sz w:val="19"/>
+                <w:szCs w:val="19"/>
+              </w:rPr>
+              <w:t xml:space="preserve">Option B:</w:t>
+            </w:r>
+            <w:r>
+              <w:rPr>
+                <w:rFonts w:ascii="Courier New" w:cs="Courier New" w:eastAsia="Courier New" w:hAnsi="Courier New"/>
+                <w:color w:val="1e293b"/>
+                <w:sz w:val="19"/>
+                <w:szCs w:val="19"/>
+              </w:rPr>
+              <w:t xml:space="preserve">  Helps consolidate memory</w:t>
+            </w:r>
+          </w:p>
+          <w:p>
+            <w:pPr>
+              <w:shd w:fill="FAFAFA" w:val="clear"/>
+              <w:spacing w:after="30" w:before="30"/>
+              <w:ind w:left="431"/>
+            </w:pPr>
+            <w:r>
+              <w:rPr>
+                <w:rFonts w:ascii="Courier New" w:cs="Courier New" w:eastAsia="Courier New" w:hAnsi="Courier New"/>
+                <w:b/>
+                <w:bCs/>
+                <w:color w:val="7C3AED"/>
+                <w:sz w:val="19"/>
+                <w:szCs w:val="19"/>
+              </w:rPr>
+              <w:t xml:space="preserve">Option B Secondary:</w:t>
+            </w:r>
+            <w:r>
+              <w:rPr>
+                <w:rFonts w:ascii="Courier New" w:cs="Courier New" w:eastAsia="Courier New" w:hAnsi="Courier New"/>
+                <w:color w:val="4338a0"/>
+                <w:sz w:val="19"/>
+                <w:szCs w:val="19"/>
+              </w:rPr>
+              <w:t xml:space="preserve">  स्मृति समेकन में सहायक है</w:t>
+            </w:r>
+          </w:p>
+          <w:p>
+            <w:pPr>
+              <w:shd w:fill="FAFAFA" w:val="clear"/>
+              <w:spacing w:after="30" w:before="30"/>
+              <w:ind w:left="431"/>
+            </w:pPr>
+            <w:r>
+              <w:rPr>
+                <w:rFonts w:ascii="Courier New" w:cs="Courier New" w:eastAsia="Courier New" w:hAnsi="Courier New"/>
+                <w:b/>
+                <w:bCs/>
+                <w:color w:val="7C3AED"/>
+                <w:sz w:val="19"/>
+                <w:szCs w:val="19"/>
+              </w:rPr>
+              <w:t xml:space="preserve">Option C:</w:t>
+            </w:r>
+            <w:r>
+              <w:rPr>
+                <w:rFonts w:ascii="Courier New" w:cs="Courier New" w:eastAsia="Courier New" w:hAnsi="Courier New"/>
+                <w:color w:val="1e293b"/>
+                <w:sz w:val="19"/>
+                <w:szCs w:val="19"/>
+              </w:rPr>
+              <w:t xml:space="preserve">  Reduces appetite</w:t>
+            </w:r>
+          </w:p>
+          <w:p>
+            <w:pPr>
+              <w:shd w:fill="FAFAFA" w:val="clear"/>
+              <w:spacing w:after="30" w:before="30"/>
+              <w:ind w:left="431"/>
+            </w:pPr>
+            <w:r>
+              <w:rPr>
+                <w:rFonts w:ascii="Courier New" w:cs="Courier New" w:eastAsia="Courier New" w:hAnsi="Courier New"/>
+                <w:b/>
+                <w:bCs/>
+                <w:color w:val="7C3AED"/>
+                <w:sz w:val="19"/>
+                <w:szCs w:val="19"/>
+              </w:rPr>
+              <w:t xml:space="preserve">Option C Secondary:</w:t>
+            </w:r>
+            <w:r>
+              <w:rPr>
+                <w:rFonts w:ascii="Courier New" w:cs="Courier New" w:eastAsia="Courier New" w:hAnsi="Courier New"/>
+                <w:color w:val="4338a0"/>
+                <w:sz w:val="19"/>
+                <w:szCs w:val="19"/>
+              </w:rPr>
+              <w:t xml:space="preserve">  भूख कम करती है</w:t>
+            </w:r>
+          </w:p>
+          <w:p>
+            <w:pPr>
+              <w:shd w:fill="FAFAFA" w:val="clear"/>
+              <w:spacing w:after="30" w:before="30"/>
+              <w:ind w:left="431"/>
+            </w:pPr>
+            <w:r>
+              <w:rPr>
+                <w:rFonts w:ascii="Courier New" w:cs="Courier New" w:eastAsia="Courier New" w:hAnsi="Courier New"/>
+                <w:b/>
+                <w:bCs/>
+                <w:color w:val="7C3AED"/>
+                <w:sz w:val="19"/>
+                <w:szCs w:val="19"/>
+              </w:rPr>
+              <w:t xml:space="preserve">Option D:</w:t>
+            </w:r>
+            <w:r>
+              <w:rPr>
+                <w:rFonts w:ascii="Courier New" w:cs="Courier New" w:eastAsia="Courier New" w:hAnsi="Courier New"/>
+                <w:color w:val="1e293b"/>
+                <w:sz w:val="19"/>
+                <w:szCs w:val="19"/>
+              </w:rPr>
+              <w:t xml:space="preserve">  Increases reaction time</w:t>
+            </w:r>
+          </w:p>
+          <w:p>
+            <w:pPr>
+              <w:shd w:fill="FAFAFA" w:val="clear"/>
+              <w:spacing w:after="30" w:before="30"/>
+              <w:ind w:left="431"/>
+            </w:pPr>
+            <w:r>
+              <w:rPr>
+                <w:rFonts w:ascii="Courier New" w:cs="Courier New" w:eastAsia="Courier New" w:hAnsi="Courier New"/>
+                <w:b/>
+                <w:bCs/>
+                <w:color w:val="7C3AED"/>
+                <w:sz w:val="19"/>
+                <w:szCs w:val="19"/>
+              </w:rPr>
+              <w:t xml:space="preserve">Option D Secondary:</w:t>
+            </w:r>
+            <w:r>
+              <w:rPr>
+                <w:rFonts w:ascii="Courier New" w:cs="Courier New" w:eastAsia="Courier New" w:hAnsi="Courier New"/>
+                <w:color w:val="4338a0"/>
+                <w:sz w:val="19"/>
+                <w:szCs w:val="19"/>
+              </w:rPr>
+              <w:t xml:space="preserve">  प्रतिक्रिया समय बढ़ाती है</w:t>
+            </w:r>
+          </w:p>
+          <w:p>
+            <w:pPr>
+              <w:shd w:fill="FAFAFA" w:val="clear"/>
+              <w:spacing w:after="30" w:before="30"/>
+              <w:ind w:left="431"/>
+            </w:pPr>
+            <w:r>
+              <w:rPr>
+                <w:rFonts w:ascii="Courier New" w:cs="Courier New" w:eastAsia="Courier New" w:hAnsi="Courier New"/>
+                <w:b/>
+                <w:bCs/>
+                <w:color w:val="7C3AED"/>
+                <w:sz w:val="19"/>
+                <w:szCs w:val="19"/>
+              </w:rPr>
+              <w:t xml:space="preserve">Correct Answer:</w:t>
+            </w:r>
+            <w:r>
+              <w:rPr>
+                <w:rFonts w:ascii="Courier New" w:cs="Courier New" w:eastAsia="Courier New" w:hAnsi="Courier New"/>
+                <w:color w:val="065F46"/>
+                <w:sz w:val="19"/>
+                <w:szCs w:val="19"/>
+              </w:rPr>
               <w:t xml:space="preserve">  B</w:t>
             </w:r>
           </w:p>
@@ -2414,6 +3634,33 @@
                 <w:sz w:val="19"/>
                 <w:szCs w:val="19"/>
               </w:rPr>
+              <w:t xml:space="preserve">Type:</w:t>
+            </w:r>
+            <w:r>
+              <w:rPr>
+                <w:rFonts w:ascii="Courier New" w:cs="Courier New" w:eastAsia="Courier New" w:hAnsi="Courier New"/>
+                <w:color w:val="6B7280"/>
+                <w:sz w:val="19"/>
+                <w:szCs w:val="19"/>
+              </w:rPr>
+              <w:t xml:space="preserve">  MCQ_SINGLE</w:t>
+            </w:r>
+          </w:p>
+          <w:p>
+            <w:pPr>
+              <w:shd w:fill="FAFAFA" w:val="clear"/>
+              <w:spacing w:after="30" w:before="30"/>
+              <w:ind w:left="431"/>
+            </w:pPr>
+            <w:r>
+              <w:rPr>
+                <w:rFonts w:ascii="Courier New" w:cs="Courier New" w:eastAsia="Courier New" w:hAnsi="Courier New"/>
+                <w:b/>
+                <w:bCs/>
+                <w:color w:val="7C3AED"/>
+                <w:sz w:val="19"/>
+                <w:szCs w:val="19"/>
+              </w:rPr>
               <w:t xml:space="preserve">Difficulty:</w:t>
             </w:r>
             <w:r>
@@ -2423,7 +3670,7 @@
                 <w:sz w:val="19"/>
                 <w:szCs w:val="19"/>
               </w:rPr>
-              <w:t xml:space="preserve">  HARD</w:t>
+              <w:t xml:space="preserve">  EASY</w:t>
             </w:r>
           </w:p>
           <w:p>
@@ -2450,7 +3697,34 @@
                 <w:sz w:val="19"/>
                 <w:szCs w:val="19"/>
               </w:rPr>
-              <w:t xml:space="preserve">  (2021 value − 2020 value) / 2020 value × 100 ≈ 15%.</w:t>
+              <w:t xml:space="preserve">  The passage states sleep plays a vital role in memory consolidation.</w:t>
+            </w:r>
+          </w:p>
+          <w:p>
+            <w:pPr>
+              <w:shd w:fill="FAFAFA" w:val="clear"/>
+              <w:spacing w:after="30" w:before="30"/>
+              <w:ind w:left="431"/>
+            </w:pPr>
+            <w:r>
+              <w:rPr>
+                <w:rFonts w:ascii="Courier New" w:cs="Courier New" w:eastAsia="Courier New" w:hAnsi="Courier New"/>
+                <w:b/>
+                <w:bCs/>
+                <w:color w:val="7C3AED"/>
+                <w:sz w:val="19"/>
+                <w:szCs w:val="19"/>
+              </w:rPr>
+              <w:t xml:space="preserve">Explanation Secondary:</w:t>
+            </w:r>
+            <w:r>
+              <w:rPr>
+                <w:rFonts w:ascii="Courier New" w:cs="Courier New" w:eastAsia="Courier New" w:hAnsi="Courier New"/>
+                <w:color w:val="4338a0"/>
+                <w:sz w:val="19"/>
+                <w:szCs w:val="19"/>
+              </w:rPr>
+              <w:t xml:space="preserve">  गद्यांश में कहा गया है कि नींद स्मृति समेकन में महत्वपूर्ण भूमिका निभाती है।</w:t>
             </w:r>
           </w:p>
           <w:p>
@@ -2536,7 +3810,34 @@
                 <w:sz w:val="19"/>
                 <w:szCs w:val="19"/>
               </w:rPr>
-              <w:t xml:space="preserve">  Which year recorded the lowest production?</w:t>
+              <w:t xml:space="preserve">  Who made the discovery mentioned in the passage?</w:t>
+            </w:r>
+          </w:p>
+          <w:p>
+            <w:pPr>
+              <w:shd w:fill="FAFAFA" w:val="clear"/>
+              <w:spacing w:after="30" w:before="30"/>
+              <w:ind w:left="431"/>
+            </w:pPr>
+            <w:r>
+              <w:rPr>
+                <w:rFonts w:ascii="Courier New" w:cs="Courier New" w:eastAsia="Courier New" w:hAnsi="Courier New"/>
+                <w:b/>
+                <w:bCs/>
+                <w:color w:val="7C3AED"/>
+                <w:sz w:val="19"/>
+                <w:szCs w:val="19"/>
+              </w:rPr>
+              <w:t xml:space="preserve">Question Secondary:</w:t>
+            </w:r>
+            <w:r>
+              <w:rPr>
+                <w:rFonts w:ascii="Courier New" w:cs="Courier New" w:eastAsia="Courier New" w:hAnsi="Courier New"/>
+                <w:color w:val="4338a0"/>
+                <w:sz w:val="19"/>
+                <w:szCs w:val="19"/>
+              </w:rPr>
+              <w:t xml:space="preserve">  गद्यांश में उल्लिखित खोज किसने की?</w:t>
             </w:r>
           </w:p>
           <w:p>
@@ -2563,7 +3864,34 @@
                 <w:sz w:val="19"/>
                 <w:szCs w:val="19"/>
               </w:rPr>
-              <w:t xml:space="preserve">  2019</w:t>
+              <w:t xml:space="preserve">  Doctors</w:t>
+            </w:r>
+          </w:p>
+          <w:p>
+            <w:pPr>
+              <w:shd w:fill="FAFAFA" w:val="clear"/>
+              <w:spacing w:after="30" w:before="30"/>
+              <w:ind w:left="431"/>
+            </w:pPr>
+            <w:r>
+              <w:rPr>
+                <w:rFonts w:ascii="Courier New" w:cs="Courier New" w:eastAsia="Courier New" w:hAnsi="Courier New"/>
+                <w:b/>
+                <w:bCs/>
+                <w:color w:val="7C3AED"/>
+                <w:sz w:val="19"/>
+                <w:szCs w:val="19"/>
+              </w:rPr>
+              <w:t xml:space="preserve">Option A Secondary:</w:t>
+            </w:r>
+            <w:r>
+              <w:rPr>
+                <w:rFonts w:ascii="Courier New" w:cs="Courier New" w:eastAsia="Courier New" w:hAnsi="Courier New"/>
+                <w:color w:val="4338a0"/>
+                <w:sz w:val="19"/>
+                <w:szCs w:val="19"/>
+              </w:rPr>
+              <w:t xml:space="preserve">  डॉक्टर</w:t>
             </w:r>
           </w:p>
           <w:p>
@@ -2590,7 +3918,34 @@
                 <w:sz w:val="19"/>
                 <w:szCs w:val="19"/>
               </w:rPr>
-              <w:t xml:space="preserve">  2020</w:t>
+              <w:t xml:space="preserve">  Engineers</w:t>
+            </w:r>
+          </w:p>
+          <w:p>
+            <w:pPr>
+              <w:shd w:fill="FAFAFA" w:val="clear"/>
+              <w:spacing w:after="30" w:before="30"/>
+              <w:ind w:left="431"/>
+            </w:pPr>
+            <w:r>
+              <w:rPr>
+                <w:rFonts w:ascii="Courier New" w:cs="Courier New" w:eastAsia="Courier New" w:hAnsi="Courier New"/>
+                <w:b/>
+                <w:bCs/>
+                <w:color w:val="7C3AED"/>
+                <w:sz w:val="19"/>
+                <w:szCs w:val="19"/>
+              </w:rPr>
+              <w:t xml:space="preserve">Option B Secondary:</w:t>
+            </w:r>
+            <w:r>
+              <w:rPr>
+                <w:rFonts w:ascii="Courier New" w:cs="Courier New" w:eastAsia="Courier New" w:hAnsi="Courier New"/>
+                <w:color w:val="4338a0"/>
+                <w:sz w:val="19"/>
+                <w:szCs w:val="19"/>
+              </w:rPr>
+              <w:t xml:space="preserve">  इंजीनियर</w:t>
             </w:r>
           </w:p>
           <w:p>
@@ -2617,7 +3972,34 @@
                 <w:sz w:val="19"/>
                 <w:szCs w:val="19"/>
               </w:rPr>
-              <w:t xml:space="preserve">  2022</w:t>
+              <w:t xml:space="preserve">  Scientists</w:t>
+            </w:r>
+          </w:p>
+          <w:p>
+            <w:pPr>
+              <w:shd w:fill="FAFAFA" w:val="clear"/>
+              <w:spacing w:after="30" w:before="30"/>
+              <w:ind w:left="431"/>
+            </w:pPr>
+            <w:r>
+              <w:rPr>
+                <w:rFonts w:ascii="Courier New" w:cs="Courier New" w:eastAsia="Courier New" w:hAnsi="Courier New"/>
+                <w:b/>
+                <w:bCs/>
+                <w:color w:val="7C3AED"/>
+                <w:sz w:val="19"/>
+                <w:szCs w:val="19"/>
+              </w:rPr>
+              <w:t xml:space="preserve">Option C Secondary:</w:t>
+            </w:r>
+            <w:r>
+              <w:rPr>
+                <w:rFonts w:ascii="Courier New" w:cs="Courier New" w:eastAsia="Courier New" w:hAnsi="Courier New"/>
+                <w:color w:val="4338a0"/>
+                <w:sz w:val="19"/>
+                <w:szCs w:val="19"/>
+              </w:rPr>
+              <w:t xml:space="preserve">  वैज्ञानिक</w:t>
             </w:r>
           </w:p>
           <w:p>
@@ -2644,7 +4026,34 @@
                 <w:sz w:val="19"/>
                 <w:szCs w:val="19"/>
               </w:rPr>
-              <w:t xml:space="preserve">  2023</w:t>
+              <w:t xml:space="preserve">  Athletes</w:t>
+            </w:r>
+          </w:p>
+          <w:p>
+            <w:pPr>
+              <w:shd w:fill="FAFAFA" w:val="clear"/>
+              <w:spacing w:after="30" w:before="30"/>
+              <w:ind w:left="431"/>
+            </w:pPr>
+            <w:r>
+              <w:rPr>
+                <w:rFonts w:ascii="Courier New" w:cs="Courier New" w:eastAsia="Courier New" w:hAnsi="Courier New"/>
+                <w:b/>
+                <w:bCs/>
+                <w:color w:val="7C3AED"/>
+                <w:sz w:val="19"/>
+                <w:szCs w:val="19"/>
+              </w:rPr>
+              <w:t xml:space="preserve">Option D Secondary:</w:t>
+            </w:r>
+            <w:r>
+              <w:rPr>
+                <w:rFonts w:ascii="Courier New" w:cs="Courier New" w:eastAsia="Courier New" w:hAnsi="Courier New"/>
+                <w:color w:val="4338a0"/>
+                <w:sz w:val="19"/>
+                <w:szCs w:val="19"/>
+              </w:rPr>
+              <w:t xml:space="preserve">  एथलीट</w:t>
             </w:r>
           </w:p>
           <w:p>
@@ -2671,7 +4080,34 @@
                 <w:sz w:val="19"/>
                 <w:szCs w:val="19"/>
               </w:rPr>
-              <w:t xml:space="preserve">  A</w:t>
+              <w:t xml:space="preserve">  C</w:t>
+            </w:r>
+          </w:p>
+          <w:p>
+            <w:pPr>
+              <w:shd w:fill="FAFAFA" w:val="clear"/>
+              <w:spacing w:after="30" w:before="30"/>
+              <w:ind w:left="431"/>
+            </w:pPr>
+            <w:r>
+              <w:rPr>
+                <w:rFonts w:ascii="Courier New" w:cs="Courier New" w:eastAsia="Courier New" w:hAnsi="Courier New"/>
+                <w:b/>
+                <w:bCs/>
+                <w:color w:val="7C3AED"/>
+                <w:sz w:val="19"/>
+                <w:szCs w:val="19"/>
+              </w:rPr>
+              <w:t xml:space="preserve">Type:</w:t>
+            </w:r>
+            <w:r>
+              <w:rPr>
+                <w:rFonts w:ascii="Courier New" w:cs="Courier New" w:eastAsia="Courier New" w:hAnsi="Courier New"/>
+                <w:color w:val="6B7280"/>
+                <w:sz w:val="19"/>
+                <w:szCs w:val="19"/>
+              </w:rPr>
+              <w:t xml:space="preserve">  MCQ_SINGLE</w:t>
             </w:r>
           </w:p>
           <w:p>
@@ -2725,7 +4161,34 @@
                 <w:sz w:val="19"/>
                 <w:szCs w:val="19"/>
               </w:rPr>
-              <w:t xml:space="preserve">  2019 had the lowest bar in the chart.</w:t>
+              <w:t xml:space="preserve">  The passage explicitly mentions 'Scientists have discovered'.</w:t>
+            </w:r>
+          </w:p>
+          <w:p>
+            <w:pPr>
+              <w:shd w:fill="FAFAFA" w:val="clear"/>
+              <w:spacing w:after="30" w:before="30"/>
+              <w:ind w:left="431"/>
+            </w:pPr>
+            <w:r>
+              <w:rPr>
+                <w:rFonts w:ascii="Courier New" w:cs="Courier New" w:eastAsia="Courier New" w:hAnsi="Courier New"/>
+                <w:b/>
+                <w:bCs/>
+                <w:color w:val="7C3AED"/>
+                <w:sz w:val="19"/>
+                <w:szCs w:val="19"/>
+              </w:rPr>
+              <w:t xml:space="preserve">Explanation Secondary:</w:t>
+            </w:r>
+            <w:r>
+              <w:rPr>
+                <w:rFonts w:ascii="Courier New" w:cs="Courier New" w:eastAsia="Courier New" w:hAnsi="Courier New"/>
+                <w:color w:val="4338a0"/>
+                <w:sz w:val="19"/>
+                <w:szCs w:val="19"/>
+              </w:rPr>
+              <w:t xml:space="preserve">  गद्यांश में स्पष्ट रूप से 'वैज्ञानिकों ने खोज की है' लिखा है।</w:t>
             </w:r>
           </w:p>
           <w:p>

</xml_diff>